<commit_message>
docs: complete non-functional requirements in SRS section 2.2
- Add availability, fault analysis, maintainability, and
  internationalization/localization items to match the course template
- Note in report.md where the non-functional requirements live
- Remove question-answer.md

Co-Authored-By: Claude Opus 5.5 <noreply@anthropic.com>
</commit_message>
<xml_diff>
--- a/docs/SE_Experiment/知织（Labloom）需求规格说明书.docx
+++ b/docs/SE_Experiment/知织（Labloom）需求规格说明书.docx
@@ -19,11 +19,7 @@
       </w:pPr>
       <w:r>
         <w:t>知织（Labloom）</w:t>
-      </w:r>
-      <w:r>
         <w:br w:type="textWrapping"/>
-      </w:r>
-      <w:r>
         <w:t>需求规格说明书</w:t>
       </w:r>
     </w:p>
@@ -42,11 +38,7 @@
       </w:pPr>
       <w:r>
         <w:t>版本 1.2</w:t>
-      </w:r>
-      <w:r>
         <w:br w:type="textWrapping"/>
-      </w:r>
-      <w:r>
         <w:t>2026 年 10 月 27 日</w:t>
       </w:r>
     </w:p>
@@ -809,7 +801,7 @@
     </w:p>
     <w:p>
       <w:r>
-        <w:t>以下性能指标沿用已有需求文档，作为本实验的验收目标。</w:t>
+        <w:t>以下要求作为本实验的验收目标，其中性能和容量指标沿用已有需求文档。</w:t>
       </w:r>
     </w:p>
     <w:tbl>
@@ -987,7 +979,7 @@
                 <w:rFonts w:ascii="DejaVu Serif" w:hAnsi="DejaVu Serif" w:eastAsia="Noto Serif CJK SC"/>
                 <w:sz w:val="19"/>
               </w:rPr>
-              <w:t>保存与可靠性</w:t>
+              <w:t>可用性</w:t>
             </w:r>
           </w:p>
         </w:tc>
@@ -1005,7 +997,7 @@
                 <w:rFonts w:ascii="DejaVu Serif" w:hAnsi="DejaVu Serif" w:eastAsia="Noto Serif CJK SC"/>
                 <w:sz w:val="19"/>
               </w:rPr>
-              <w:t>常规编辑停止后1秒内完成自动保存；重新打开工作区后可读取已保存内容。</w:t>
+              <w:t>读取和编辑本地资料不依赖网络；断网时只有订阅刷新不可用，已有的文献、笔记和订阅条目仍可正常使用。</w:t>
             </w:r>
           </w:p>
         </w:tc>
@@ -1029,7 +1021,7 @@
                 <w:rFonts w:ascii="DejaVu Serif" w:hAnsi="DejaVu Serif" w:eastAsia="Noto Serif CJK SC"/>
                 <w:sz w:val="19"/>
               </w:rPr>
-              <w:t>安全性</w:t>
+              <w:t>保存与可靠性</w:t>
             </w:r>
           </w:p>
         </w:tc>
@@ -1047,7 +1039,7 @@
                 <w:rFonts w:ascii="DejaVu Serif" w:hAnsi="DejaVu Serif" w:eastAsia="Noto Serif CJK SC"/>
                 <w:sz w:val="19"/>
               </w:rPr>
-              <w:t>研究资料保存在本地；联网获取订阅及用户选择的资料。</w:t>
+              <w:t>常规编辑停止后1秒内完成自动保存；重新打开工作区后可读取已保存内容。</w:t>
             </w:r>
           </w:p>
         </w:tc>
@@ -1071,6 +1063,90 @@
                 <w:rFonts w:ascii="DejaVu Serif" w:hAnsi="DejaVu Serif" w:eastAsia="Noto Serif CJK SC"/>
                 <w:sz w:val="19"/>
               </w:rPr>
+              <w:t>故障分析</w:t>
+            </w:r>
+          </w:p>
+        </w:tc>
+        <w:tc>
+          <w:tcPr>
+            <w:tcW w:w="7370" w:type="dxa"/>
+            <w:vAlign w:val="center"/>
+          </w:tcPr>
+          <w:p>
+            <w:pPr>
+              <w:spacing w:before="40" w:after="40" w:line="264" w:lineRule="auto"/>
+            </w:pPr>
+            <w:r>
+              <w:rPr>
+                <w:rFonts w:ascii="DejaVu Serif" w:hAnsi="DejaVu Serif" w:eastAsia="Noto Serif CJK SC"/>
+                <w:sz w:val="19"/>
+              </w:rPr>
+              <w:t>可能的故障有保存失败、订阅抓取失败和 PDF 文件损坏或丢失。保存失败时保留当前编辑内容并提示重试；某个订阅源抓取失败时只提示该来源的原因，不影响其他来源和已有条目；PDF 无法打开时提示文件不可用，保留文献记录。</w:t>
+            </w:r>
+          </w:p>
+        </w:tc>
+      </w:tr>
+      <w:tr>
+        <w:trPr>
+          <w:cantSplit/>
+          <w:jc w:val="center"/>
+        </w:trPr>
+        <w:tc>
+          <w:tcPr>
+            <w:tcW w:w="1701" w:type="dxa"/>
+            <w:vAlign w:val="center"/>
+          </w:tcPr>
+          <w:p>
+            <w:pPr>
+              <w:spacing w:before="40" w:after="40" w:line="264" w:lineRule="auto"/>
+            </w:pPr>
+            <w:r>
+              <w:rPr>
+                <w:rFonts w:ascii="DejaVu Serif" w:hAnsi="DejaVu Serif" w:eastAsia="Noto Serif CJK SC"/>
+                <w:sz w:val="19"/>
+              </w:rPr>
+              <w:t>安全性</w:t>
+            </w:r>
+          </w:p>
+        </w:tc>
+        <w:tc>
+          <w:tcPr>
+            <w:tcW w:w="7370" w:type="dxa"/>
+            <w:vAlign w:val="center"/>
+          </w:tcPr>
+          <w:p>
+            <w:pPr>
+              <w:spacing w:before="40" w:after="40" w:line="264" w:lineRule="auto"/>
+            </w:pPr>
+            <w:r>
+              <w:rPr>
+                <w:rFonts w:ascii="DejaVu Serif" w:hAnsi="DejaVu Serif" w:eastAsia="Noto Serif CJK SC"/>
+                <w:sz w:val="19"/>
+              </w:rPr>
+              <w:t>研究资料保存在本地；联网获取订阅及用户选择的资料。</w:t>
+            </w:r>
+          </w:p>
+        </w:tc>
+      </w:tr>
+      <w:tr>
+        <w:trPr>
+          <w:cantSplit/>
+          <w:jc w:val="center"/>
+        </w:trPr>
+        <w:tc>
+          <w:tcPr>
+            <w:tcW w:w="1701" w:type="dxa"/>
+            <w:vAlign w:val="center"/>
+          </w:tcPr>
+          <w:p>
+            <w:pPr>
+              <w:spacing w:before="40" w:after="40" w:line="264" w:lineRule="auto"/>
+            </w:pPr>
+            <w:r>
+              <w:rPr>
+                <w:rFonts w:ascii="DejaVu Serif" w:hAnsi="DejaVu Serif" w:eastAsia="Noto Serif CJK SC"/>
+                <w:sz w:val="19"/>
+              </w:rPr>
               <w:t>易用性</w:t>
             </w:r>
           </w:p>
@@ -1090,6 +1166,90 @@
                 <w:sz w:val="19"/>
               </w:rPr>
               <w:t>列表、阅读器和编辑器提供清晰入口；显示加载、保存和操作结果。</w:t>
+            </w:r>
+          </w:p>
+        </w:tc>
+      </w:tr>
+      <w:tr>
+        <w:trPr>
+          <w:cantSplit/>
+          <w:jc w:val="center"/>
+        </w:trPr>
+        <w:tc>
+          <w:tcPr>
+            <w:tcW w:w="1701" w:type="dxa"/>
+            <w:vAlign w:val="center"/>
+          </w:tcPr>
+          <w:p>
+            <w:pPr>
+              <w:spacing w:before="40" w:after="40" w:line="264" w:lineRule="auto"/>
+            </w:pPr>
+            <w:r>
+              <w:rPr>
+                <w:rFonts w:ascii="DejaVu Serif" w:hAnsi="DejaVu Serif" w:eastAsia="Noto Serif CJK SC"/>
+                <w:sz w:val="19"/>
+              </w:rPr>
+              <w:t>可维护性</w:t>
+            </w:r>
+          </w:p>
+        </w:tc>
+        <w:tc>
+          <w:tcPr>
+            <w:tcW w:w="7370" w:type="dxa"/>
+            <w:vAlign w:val="center"/>
+          </w:tcPr>
+          <w:p>
+            <w:pPr>
+              <w:spacing w:before="40" w:after="40" w:line="264" w:lineRule="auto"/>
+            </w:pPr>
+            <w:r>
+              <w:rPr>
+                <w:rFonts w:ascii="DejaVu Serif" w:hAnsi="DejaVu Serif" w:eastAsia="Noto Serif CJK SC"/>
+                <w:sz w:val="19"/>
+              </w:rPr>
+              <w:t>系统按界面、业务和数据存储分层，模块之间只通过接口调用；数据库结构变更通过带版本号的迁移完成，已发布的迁移不再修改。</w:t>
+            </w:r>
+          </w:p>
+        </w:tc>
+      </w:tr>
+      <w:tr>
+        <w:trPr>
+          <w:cantSplit/>
+          <w:jc w:val="center"/>
+        </w:trPr>
+        <w:tc>
+          <w:tcPr>
+            <w:tcW w:w="1701" w:type="dxa"/>
+            <w:vAlign w:val="center"/>
+          </w:tcPr>
+          <w:p>
+            <w:pPr>
+              <w:spacing w:before="40" w:after="40" w:line="264" w:lineRule="auto"/>
+            </w:pPr>
+            <w:r>
+              <w:rPr>
+                <w:rFonts w:ascii="DejaVu Serif" w:hAnsi="DejaVu Serif" w:eastAsia="Noto Serif CJK SC"/>
+                <w:sz w:val="19"/>
+              </w:rPr>
+              <w:t>国际化和本地化</w:t>
+            </w:r>
+          </w:p>
+        </w:tc>
+        <w:tc>
+          <w:tcPr>
+            <w:tcW w:w="7370" w:type="dxa"/>
+            <w:vAlign w:val="center"/>
+          </w:tcPr>
+          <w:p>
+            <w:pPr>
+              <w:spacing w:before="40" w:after="40" w:line="264" w:lineRule="auto"/>
+            </w:pPr>
+            <w:r>
+              <w:rPr>
+                <w:rFonts w:ascii="DejaVu Serif" w:hAnsi="DejaVu Serif" w:eastAsia="Noto Serif CJK SC"/>
+                <w:sz w:val="19"/>
+              </w:rPr>
+              <w:t>初版提供简体中文界面，日期和时间按系统的区域设置显示；界面文字集中管理，以后可以增加其他语言。</w:t>
             </w:r>
           </w:p>
         </w:tc>

</xml_diff>